<commit_message>
Added speed increase mechanic; Added an image for the projectile; Made a design flowchart and presentation with prototypes and inspiration
</commit_message>
<xml_diff>
--- a/doc/design/design.docx
+++ b/doc/design/design.docx
@@ -51,6 +51,10 @@
     <w:p>
       <w:pPr>
         <w:pStyle w:val="Heading1"/>
+        <w:numPr>
+          <w:ilvl w:val="0"/>
+          <w:numId w:val="1"/>
+        </w:numPr>
         <w:bidi w:val="0"/>
         <w:ind w:hanging="0" w:start="0"/>
         <w:jc w:val="start"/>
@@ -64,6 +68,10 @@
     <w:p>
       <w:pPr>
         <w:pStyle w:val="Heading2"/>
+        <w:numPr>
+          <w:ilvl w:val="1"/>
+          <w:numId w:val="1"/>
+        </w:numPr>
         <w:bidi w:val="0"/>
         <w:ind w:hanging="0" w:start="0"/>
         <w:jc w:val="start"/>
@@ -91,12 +99,12 @@
           <wp:anchor distT="0" distB="0" distL="0" distR="0" simplePos="0" relativeHeight="2" behindDoc="0" locked="0" layoutInCell="0" allowOverlap="1">
             <wp:simplePos x="0" y="0"/>
             <wp:positionH relativeFrom="column">
-              <wp:posOffset>-17145</wp:posOffset>
+              <wp:posOffset>1544320</wp:posOffset>
             </wp:positionH>
             <wp:positionV relativeFrom="paragraph">
-              <wp:posOffset>24130</wp:posOffset>
+              <wp:posOffset>161290</wp:posOffset>
             </wp:positionV>
-            <wp:extent cx="6332220" cy="3565525"/>
+            <wp:extent cx="4402455" cy="2479040"/>
             <wp:effectExtent l="0" t="0" r="0" b="0"/>
             <wp:wrapSquare wrapText="largest"/>
             <wp:docPr id="1" name="Image1"/>
@@ -121,7 +129,7 @@
                   <pic:spPr bwMode="auto">
                     <a:xfrm>
                       <a:off x="0" y="0"/>
-                      <a:ext cx="6332220" cy="3565525"/>
+                      <a:ext cx="4402455" cy="2479040"/>
                     </a:xfrm>
                     <a:prstGeom prst="rect">
                       <a:avLst/>
@@ -142,139 +150,132 @@
         <w:jc w:val="start"/>
         <w:rPr/>
       </w:pPr>
-      <w:hyperlink r:id="rId4">
-        <w:r>
-          <w:rPr/>
-        </w:r>
-      </w:hyperlink>
-    </w:p>
-    <w:p>
-      <w:pPr>
-        <w:pStyle w:val="BodyText"/>
-        <w:bidi w:val="0"/>
-        <w:jc w:val="start"/>
-        <w:rPr/>
-      </w:pPr>
-      <w:hyperlink r:id="rId5">
-        <w:r>
-          <w:rPr/>
-        </w:r>
-      </w:hyperlink>
-    </w:p>
-    <w:p>
-      <w:pPr>
-        <w:pStyle w:val="BodyText"/>
-        <w:bidi w:val="0"/>
-        <w:jc w:val="start"/>
-        <w:rPr/>
-      </w:pPr>
-      <w:hyperlink r:id="rId6">
-        <w:r>
-          <w:rPr/>
-        </w:r>
-      </w:hyperlink>
-    </w:p>
-    <w:p>
-      <w:pPr>
-        <w:pStyle w:val="BodyText"/>
-        <w:bidi w:val="0"/>
-        <w:jc w:val="start"/>
-        <w:rPr/>
-      </w:pPr>
-      <w:hyperlink r:id="rId7">
-        <w:r>
-          <w:rPr/>
-        </w:r>
-      </w:hyperlink>
+      <w:r>
+        <w:rPr/>
+      </w:r>
+    </w:p>
+    <w:p>
+      <w:pPr>
+        <w:pStyle w:val="BodyText"/>
+        <w:bidi w:val="0"/>
+        <w:jc w:val="start"/>
+        <w:rPr/>
+      </w:pPr>
+      <w:r>
+        <w:rPr/>
+      </w:r>
+    </w:p>
+    <w:p>
+      <w:pPr>
+        <w:pStyle w:val="BodyText"/>
+        <w:bidi w:val="0"/>
+        <w:jc w:val="start"/>
+        <w:rPr/>
+      </w:pPr>
+      <w:r>
+        <w:rPr/>
+      </w:r>
+    </w:p>
+    <w:p>
+      <w:pPr>
+        <w:pStyle w:val="BodyText"/>
+        <w:bidi w:val="0"/>
+        <w:jc w:val="start"/>
+        <w:rPr/>
+      </w:pPr>
+      <w:r>
+        <w:rPr/>
+      </w:r>
     </w:p>
     <w:p>
       <w:pPr>
         <w:pStyle w:val="Heading2"/>
+        <w:numPr>
+          <w:ilvl w:val="1"/>
+          <w:numId w:val="1"/>
+        </w:numPr>
         <w:bidi w:val="0"/>
         <w:ind w:hanging="0" w:start="0"/>
         <w:jc w:val="start"/>
         <w:rPr/>
       </w:pPr>
-      <w:hyperlink r:id="rId8">
-        <w:r>
-          <w:rPr/>
-        </w:r>
-      </w:hyperlink>
+      <w:r>
+        <w:rPr/>
+      </w:r>
     </w:p>
     <w:p>
       <w:pPr>
         <w:pStyle w:val="Heading2"/>
+        <w:numPr>
+          <w:ilvl w:val="1"/>
+          <w:numId w:val="1"/>
+        </w:numPr>
         <w:bidi w:val="0"/>
         <w:ind w:hanging="0" w:start="0"/>
         <w:jc w:val="start"/>
-        <w:rPr/>
-      </w:pPr>
-      <w:hyperlink r:id="rId10">
-        <w:r>
-          <w:drawing>
-            <wp:anchor distT="0" distB="0" distL="0" distR="0" simplePos="0" relativeHeight="3" behindDoc="0" locked="0" layoutInCell="0" allowOverlap="1">
-              <wp:simplePos x="0" y="0"/>
-              <wp:positionH relativeFrom="column">
-                <wp:posOffset>-42545</wp:posOffset>
-              </wp:positionH>
-              <wp:positionV relativeFrom="paragraph">
-                <wp:posOffset>433705</wp:posOffset>
-              </wp:positionV>
-              <wp:extent cx="6332220" cy="3957320"/>
-              <wp:effectExtent l="0" t="0" r="0" b="0"/>
-              <wp:wrapSquare wrapText="largest"/>
-              <wp:docPr id="2" name="Image2"/>
-              <wp:cNvGraphicFramePr>
-                <a:graphicFrameLocks xmlns:a="http://schemas.openxmlformats.org/drawingml/2006/main" noChangeAspect="1"/>
-              </wp:cNvGraphicFramePr>
-              <a:graphic xmlns:a="http://schemas.openxmlformats.org/drawingml/2006/main">
-                <a:graphicData uri="http://schemas.openxmlformats.org/drawingml/2006/picture">
-                  <pic:pic xmlns:pic="http://schemas.openxmlformats.org/drawingml/2006/picture">
-                    <pic:nvPicPr>
-                      <pic:cNvPr id="2" name="Image2"/>
-                      <pic:cNvPicPr>
-                        <a:picLocks noChangeAspect="1" noChangeArrowheads="1"/>
-                      </pic:cNvPicPr>
-                    </pic:nvPicPr>
-                    <pic:blipFill>
-                      <a:blip r:embed="rId9"/>
-                      <a:stretch>
-                        <a:fillRect/>
-                      </a:stretch>
-                    </pic:blipFill>
-                    <pic:spPr bwMode="auto">
-                      <a:xfrm>
-                        <a:off x="0" y="0"/>
-                        <a:ext cx="6332220" cy="3957320"/>
-                      </a:xfrm>
-                      <a:prstGeom prst="rect">
-                        <a:avLst/>
-                      </a:prstGeom>
-                      <a:noFill/>
-                    </pic:spPr>
-                  </pic:pic>
-                </a:graphicData>
-              </a:graphic>
-            </wp:anchor>
-          </w:drawing>
-        </w:r>
-      </w:hyperlink>
-      <w:r>
         <w:rPr>
           <w:rStyle w:val="Hyperlink"/>
         </w:rPr>
-        <w:t>Third generation of video game consoles – Wikipedia</w:t>
-      </w:r>
-    </w:p>
-    <w:p>
-      <w:pPr>
-        <w:pStyle w:val="BodyText"/>
-        <w:bidi w:val="0"/>
-        <w:jc w:val="start"/>
-        <w:rPr/>
-      </w:pPr>
-      <w:r>
-        <w:rPr/>
+      </w:pPr>
+      <w:r>
+        <w:rPr/>
+      </w:r>
+    </w:p>
+    <w:p>
+      <w:pPr>
+        <w:pStyle w:val="BodyText"/>
+        <w:bidi w:val="0"/>
+        <w:jc w:val="start"/>
+        <w:rPr/>
+      </w:pPr>
+      <w:r>
+        <w:rPr/>
+        <w:drawing>
+          <wp:anchor distT="0" distB="0" distL="0" distR="0" simplePos="0" relativeHeight="3" behindDoc="0" locked="0" layoutInCell="0" allowOverlap="1">
+            <wp:simplePos x="0" y="0"/>
+            <wp:positionH relativeFrom="column">
+              <wp:posOffset>798195</wp:posOffset>
+            </wp:positionH>
+            <wp:positionV relativeFrom="paragraph">
+              <wp:posOffset>117475</wp:posOffset>
+            </wp:positionV>
+            <wp:extent cx="4728210" cy="2954655"/>
+            <wp:effectExtent l="0" t="0" r="0" b="0"/>
+            <wp:wrapSquare wrapText="largest"/>
+            <wp:docPr id="2" name="Image2"/>
+            <wp:cNvGraphicFramePr>
+              <a:graphicFrameLocks xmlns:a="http://schemas.openxmlformats.org/drawingml/2006/main" noChangeAspect="1"/>
+            </wp:cNvGraphicFramePr>
+            <a:graphic xmlns:a="http://schemas.openxmlformats.org/drawingml/2006/main">
+              <a:graphicData uri="http://schemas.openxmlformats.org/drawingml/2006/picture">
+                <pic:pic xmlns:pic="http://schemas.openxmlformats.org/drawingml/2006/picture">
+                  <pic:nvPicPr>
+                    <pic:cNvPr id="2" name="Image2"/>
+                    <pic:cNvPicPr>
+                      <a:picLocks noChangeAspect="1" noChangeArrowheads="1"/>
+                    </pic:cNvPicPr>
+                  </pic:nvPicPr>
+                  <pic:blipFill>
+                    <a:blip r:embed="rId4"/>
+                    <a:stretch>
+                      <a:fillRect/>
+                    </a:stretch>
+                  </pic:blipFill>
+                  <pic:spPr bwMode="auto">
+                    <a:xfrm>
+                      <a:off x="0" y="0"/>
+                      <a:ext cx="4728210" cy="2954655"/>
+                    </a:xfrm>
+                    <a:prstGeom prst="rect">
+                      <a:avLst/>
+                    </a:prstGeom>
+                    <a:noFill/>
+                  </pic:spPr>
+                </pic:pic>
+              </a:graphicData>
+            </a:graphic>
+          </wp:anchor>
+        </w:drawing>
       </w:r>
     </w:p>
     <w:p>
@@ -291,6 +292,10 @@
     <w:p>
       <w:pPr>
         <w:pStyle w:val="Heading2"/>
+        <w:numPr>
+          <w:ilvl w:val="1"/>
+          <w:numId w:val="1"/>
+        </w:numPr>
         <w:bidi w:val="0"/>
         <w:ind w:hanging="0" w:start="0"/>
         <w:jc w:val="start"/>
@@ -298,7 +303,168 @@
       </w:pPr>
       <w:r>
         <w:rPr/>
+        <w:drawing>
+          <wp:anchor distT="0" distB="0" distL="0" distR="0" simplePos="0" relativeHeight="4" behindDoc="0" locked="0" layoutInCell="0" allowOverlap="1">
+            <wp:simplePos x="0" y="0"/>
+            <wp:positionH relativeFrom="column">
+              <wp:posOffset>111125</wp:posOffset>
+            </wp:positionH>
+            <wp:positionV relativeFrom="paragraph">
+              <wp:posOffset>881380</wp:posOffset>
+            </wp:positionV>
+            <wp:extent cx="6332220" cy="4268470"/>
+            <wp:effectExtent l="0" t="0" r="0" b="0"/>
+            <wp:wrapSquare wrapText="largest"/>
+            <wp:docPr id="3" name="Image3"/>
+            <wp:cNvGraphicFramePr>
+              <a:graphicFrameLocks xmlns:a="http://schemas.openxmlformats.org/drawingml/2006/main" noChangeAspect="1"/>
+            </wp:cNvGraphicFramePr>
+            <a:graphic xmlns:a="http://schemas.openxmlformats.org/drawingml/2006/main">
+              <a:graphicData uri="http://schemas.openxmlformats.org/drawingml/2006/picture">
+                <pic:pic xmlns:pic="http://schemas.openxmlformats.org/drawingml/2006/picture">
+                  <pic:nvPicPr>
+                    <pic:cNvPr id="3" name="Image3"/>
+                    <pic:cNvPicPr>
+                      <a:picLocks noChangeAspect="1" noChangeArrowheads="1"/>
+                    </pic:cNvPicPr>
+                  </pic:nvPicPr>
+                  <pic:blipFill>
+                    <a:blip r:embed="rId5"/>
+                    <a:stretch>
+                      <a:fillRect/>
+                    </a:stretch>
+                  </pic:blipFill>
+                  <pic:spPr bwMode="auto">
+                    <a:xfrm>
+                      <a:off x="0" y="0"/>
+                      <a:ext cx="6332220" cy="4268470"/>
+                    </a:xfrm>
+                    <a:prstGeom prst="rect">
+                      <a:avLst/>
+                    </a:prstGeom>
+                    <a:noFill/>
+                  </pic:spPr>
+                </pic:pic>
+              </a:graphicData>
+            </a:graphic>
+          </wp:anchor>
+        </w:drawing>
+      </w:r>
+      <w:r>
+        <w:rPr/>
         <w:t>2. Design Sketch</w:t>
+      </w:r>
+    </w:p>
+    <w:p>
+      <w:pPr>
+        <w:pStyle w:val="Heading"/>
+        <w:rPr/>
+      </w:pPr>
+      <w:r>
+        <w:rPr/>
+        <w:t>1. Early prototype</w:t>
+      </w:r>
+    </w:p>
+    <w:p>
+      <w:pPr>
+        <w:pStyle w:val="BodyText"/>
+        <w:rPr/>
+      </w:pPr>
+      <w:r>
+        <w:rPr/>
+      </w:r>
+    </w:p>
+    <w:p>
+      <w:pPr>
+        <w:pStyle w:val="BodyText"/>
+        <w:bidi w:val="0"/>
+        <w:spacing w:before="0" w:after="140"/>
+        <w:jc w:val="start"/>
+        <w:rPr/>
+      </w:pPr>
+      <w:r>
+        <w:rPr/>
+        <w:t>This image represents the ship as a rectangle, the asteroids as circles, the projectile as a square and the placement of the score counter.</w:t>
+      </w:r>
+    </w:p>
+    <w:p>
+      <w:pPr>
+        <w:pStyle w:val="BodyText"/>
+        <w:bidi w:val="0"/>
+        <w:spacing w:before="0" w:after="140"/>
+        <w:jc w:val="start"/>
+        <w:rPr/>
+      </w:pPr>
+      <w:r>
+        <w:rPr/>
+        <w:drawing>
+          <wp:anchor distT="0" distB="0" distL="0" distR="0" simplePos="0" relativeHeight="5" behindDoc="0" locked="0" layoutInCell="0" allowOverlap="1">
+            <wp:simplePos x="0" y="0"/>
+            <wp:positionH relativeFrom="column">
+              <wp:posOffset>549275</wp:posOffset>
+            </wp:positionH>
+            <wp:positionV relativeFrom="paragraph">
+              <wp:posOffset>549275</wp:posOffset>
+            </wp:positionV>
+            <wp:extent cx="5629275" cy="3201670"/>
+            <wp:effectExtent l="0" t="0" r="0" b="0"/>
+            <wp:wrapSquare wrapText="largest"/>
+            <wp:docPr id="4" name="Image4"/>
+            <wp:cNvGraphicFramePr>
+              <a:graphicFrameLocks xmlns:a="http://schemas.openxmlformats.org/drawingml/2006/main" noChangeAspect="1"/>
+            </wp:cNvGraphicFramePr>
+            <a:graphic xmlns:a="http://schemas.openxmlformats.org/drawingml/2006/main">
+              <a:graphicData uri="http://schemas.openxmlformats.org/drawingml/2006/picture">
+                <pic:pic xmlns:pic="http://schemas.openxmlformats.org/drawingml/2006/picture">
+                  <pic:nvPicPr>
+                    <pic:cNvPr id="4" name="Image4"/>
+                    <pic:cNvPicPr>
+                      <a:picLocks noChangeAspect="1" noChangeArrowheads="1"/>
+                    </pic:cNvPicPr>
+                  </pic:nvPicPr>
+                  <pic:blipFill>
+                    <a:blip r:embed="rId6"/>
+                    <a:stretch>
+                      <a:fillRect/>
+                    </a:stretch>
+                  </pic:blipFill>
+                  <pic:spPr bwMode="auto">
+                    <a:xfrm>
+                      <a:off x="0" y="0"/>
+                      <a:ext cx="5629275" cy="3201670"/>
+                    </a:xfrm>
+                    <a:prstGeom prst="rect">
+                      <a:avLst/>
+                    </a:prstGeom>
+                    <a:noFill/>
+                  </pic:spPr>
+                </pic:pic>
+              </a:graphicData>
+            </a:graphic>
+          </wp:anchor>
+        </w:drawing>
+      </w:r>
+    </w:p>
+    <w:p>
+      <w:pPr>
+        <w:pStyle w:val="Heading"/>
+        <w:rPr/>
+      </w:pPr>
+      <w:r>
+        <w:rPr/>
+        <w:t>2. Prototype with graphics</w:t>
+      </w:r>
+    </w:p>
+    <w:p>
+      <w:pPr>
+        <w:pStyle w:val="BodyText"/>
+        <w:bidi w:val="0"/>
+        <w:spacing w:before="0" w:after="140"/>
+        <w:jc w:val="start"/>
+        <w:rPr/>
+      </w:pPr>
+      <w:r>
+        <w:rPr/>
       </w:r>
     </w:p>
     <w:p>
@@ -316,10 +482,11 @@
     <w:sectPr>
       <w:type w:val="nextPage"/>
       <w:pgSz w:w="12240" w:h="15840"/>
-      <w:pgMar w:left="1134" w:right="1134" w:gutter="0" w:header="0" w:top="1134" w:footer="0" w:bottom="1134"/>
+      <w:pgMar w:left="1134" w:right="1134" w:gutter="0" w:header="0" w:top="360" w:footer="0" w:bottom="0"/>
       <w:pgNumType w:fmt="decimal"/>
       <w:formProt w:val="false"/>
       <w:textDirection w:val="lrTb"/>
+      <w:docGrid w:type="default" w:linePitch="100" w:charSpace="0"/>
     </w:sectPr>
   </w:body>
 </w:document>
@@ -331,21 +498,147 @@
     <w:lvl w:ilvl="0">
       <w:start w:val="1"/>
       <w:numFmt w:val="none"/>
-      <w:pStyle w:val="Heading1"/>
-      <w:suff w:val="nothing"/>
-      <w:lvlText w:val=""/>
-      <w:lvlJc w:val="start"/>
-      <w:pPr>
-        <w:tabs>
-          <w:tab w:val="num" w:pos="0"/>
-        </w:tabs>
-        <w:ind w:start="0" w:hanging="0"/>
-      </w:pPr>
+      <w:suff w:val="nothing"/>
+      <w:lvlText w:val=""/>
+      <w:lvlJc w:val="start"/>
+      <w:pPr>
+        <w:tabs>
+          <w:tab w:val="num" w:pos="0"/>
+        </w:tabs>
+        <w:ind w:start="0" w:hanging="0"/>
+      </w:pPr>
+      <w:rPr/>
     </w:lvl>
     <w:lvl w:ilvl="1">
       <w:start w:val="1"/>
       <w:numFmt w:val="none"/>
-      <w:pStyle w:val="Heading2"/>
+      <w:suff w:val="nothing"/>
+      <w:lvlText w:val=""/>
+      <w:lvlJc w:val="start"/>
+      <w:pPr>
+        <w:tabs>
+          <w:tab w:val="num" w:pos="0"/>
+        </w:tabs>
+        <w:ind w:start="0" w:hanging="0"/>
+      </w:pPr>
+      <w:rPr/>
+    </w:lvl>
+    <w:lvl w:ilvl="2">
+      <w:start w:val="1"/>
+      <w:numFmt w:val="none"/>
+      <w:suff w:val="nothing"/>
+      <w:lvlText w:val=""/>
+      <w:lvlJc w:val="start"/>
+      <w:pPr>
+        <w:tabs>
+          <w:tab w:val="num" w:pos="0"/>
+        </w:tabs>
+        <w:ind w:start="0" w:hanging="0"/>
+      </w:pPr>
+      <w:rPr/>
+    </w:lvl>
+    <w:lvl w:ilvl="3">
+      <w:start w:val="1"/>
+      <w:numFmt w:val="none"/>
+      <w:suff w:val="nothing"/>
+      <w:lvlText w:val=""/>
+      <w:lvlJc w:val="start"/>
+      <w:pPr>
+        <w:tabs>
+          <w:tab w:val="num" w:pos="0"/>
+        </w:tabs>
+        <w:ind w:start="0" w:hanging="0"/>
+      </w:pPr>
+      <w:rPr/>
+    </w:lvl>
+    <w:lvl w:ilvl="4">
+      <w:start w:val="1"/>
+      <w:numFmt w:val="none"/>
+      <w:suff w:val="nothing"/>
+      <w:lvlText w:val=""/>
+      <w:lvlJc w:val="start"/>
+      <w:pPr>
+        <w:tabs>
+          <w:tab w:val="num" w:pos="0"/>
+        </w:tabs>
+        <w:ind w:start="0" w:hanging="0"/>
+      </w:pPr>
+      <w:rPr/>
+    </w:lvl>
+    <w:lvl w:ilvl="5">
+      <w:start w:val="1"/>
+      <w:numFmt w:val="none"/>
+      <w:suff w:val="nothing"/>
+      <w:lvlText w:val=""/>
+      <w:lvlJc w:val="start"/>
+      <w:pPr>
+        <w:tabs>
+          <w:tab w:val="num" w:pos="0"/>
+        </w:tabs>
+        <w:ind w:start="0" w:hanging="0"/>
+      </w:pPr>
+      <w:rPr/>
+    </w:lvl>
+    <w:lvl w:ilvl="6">
+      <w:start w:val="1"/>
+      <w:numFmt w:val="none"/>
+      <w:suff w:val="nothing"/>
+      <w:lvlText w:val=""/>
+      <w:lvlJc w:val="start"/>
+      <w:pPr>
+        <w:tabs>
+          <w:tab w:val="num" w:pos="0"/>
+        </w:tabs>
+        <w:ind w:start="0" w:hanging="0"/>
+      </w:pPr>
+      <w:rPr/>
+    </w:lvl>
+    <w:lvl w:ilvl="7">
+      <w:start w:val="1"/>
+      <w:numFmt w:val="none"/>
+      <w:suff w:val="nothing"/>
+      <w:lvlText w:val=""/>
+      <w:lvlJc w:val="start"/>
+      <w:pPr>
+        <w:tabs>
+          <w:tab w:val="num" w:pos="0"/>
+        </w:tabs>
+        <w:ind w:start="0" w:hanging="0"/>
+      </w:pPr>
+      <w:rPr/>
+    </w:lvl>
+    <w:lvl w:ilvl="8">
+      <w:start w:val="1"/>
+      <w:numFmt w:val="none"/>
+      <w:suff w:val="nothing"/>
+      <w:lvlText w:val=""/>
+      <w:lvlJc w:val="start"/>
+      <w:pPr>
+        <w:tabs>
+          <w:tab w:val="num" w:pos="0"/>
+        </w:tabs>
+        <w:ind w:start="0" w:hanging="0"/>
+      </w:pPr>
+      <w:rPr/>
+    </w:lvl>
+  </w:abstractNum>
+  <w:abstractNum w:abstractNumId="2">
+    <w:lvl w:ilvl="0">
+      <w:start w:val="1"/>
+      <w:numFmt w:val="none"/>
+      <w:suff w:val="nothing"/>
+      <w:lvlText w:val=""/>
+      <w:lvlJc w:val="start"/>
+      <w:pPr>
+        <w:tabs>
+          <w:tab w:val="num" w:pos="0"/>
+        </w:tabs>
+        <w:ind w:start="0" w:hanging="0"/>
+      </w:pPr>
+    </w:lvl>
+    <w:lvl w:ilvl="1">
+      <w:start w:val="1"/>
+      <w:numFmt w:val="none"/>
       <w:suff w:val="nothing"/>
       <w:lvlText w:val=""/>
       <w:lvlJc w:val="start"/>
@@ -450,6 +743,9 @@
   </w:abstractNum>
   <w:num w:numId="1">
     <w:abstractNumId w:val="1"/>
+  </w:num>
+  <w:num w:numId="2">
+    <w:abstractNumId w:val="2"/>
   </w:num>
 </w:numbering>
 </file>
@@ -468,7 +764,6 @@
     </w:rPrDefault>
     <w:pPrDefault>
       <w:pPr>
-        <w:widowControl/>
         <w:suppressAutoHyphens w:val="true"/>
       </w:pPr>
     </w:pPrDefault>
@@ -478,7 +773,10 @@
     <w:qFormat/>
     <w:pPr>
       <w:widowControl/>
+      <w:suppressAutoHyphens w:val="true"/>
       <w:bidi w:val="0"/>
+      <w:spacing w:before="0" w:after="0"/>
+      <w:jc w:val="start"/>
     </w:pPr>
     <w:rPr>
       <w:rFonts w:ascii="Liberation Serif" w:hAnsi="Liberation Serif" w:eastAsia="Noto Sans" w:cs="FreeSans"/>
@@ -607,6 +905,30 @@
       <w:bCs/>
       <w:sz w:val="56"/>
       <w:szCs w:val="56"/>
+    </w:rPr>
+  </w:style>
+  <w:style w:type="paragraph" w:styleId="HeaderandFooter">
+    <w:name w:val="Header and Footer"/>
+    <w:basedOn w:val="Normal"/>
+    <w:qFormat/>
+    <w:pPr>
+      <w:suppressLineNumbers/>
+      <w:tabs>
+        <w:tab w:val="clear" w:pos="709"/>
+        <w:tab w:val="center" w:pos="4986" w:leader="none"/>
+        <w:tab w:val="right" w:pos="9972" w:leader="none"/>
+      </w:tabs>
+    </w:pPr>
+    <w:rPr/>
+  </w:style>
+  <w:style w:type="paragraph" w:styleId="Footer">
+    <w:name w:val="footer"/>
+    <w:basedOn w:val="HeaderandFooter"/>
+    <w:pPr>
+      <w:suppressLineNumbers/>
+    </w:pPr>
+    <w:rPr>
+      <w:sz w:val="12"/>
     </w:rPr>
   </w:style>
 </w:styles>

</xml_diff>